<commit_message>
feat(mẫu hệ cũ): Giấy biên nhận hệ cũ in giờ khai vào "Hồi … giờ …"
Hai ô trống của HE_CU_BIEN_NHAN thành ${gio} / ${phut} lấy từ cột gioTiepNhan; hồ sơ thiếu giờ vẫn in khung trống, không bịa giờ.
Mẫu đã nằm trong CSDL cần SEED_TEMPLATES_FORCE_HE_CU=1 để nạp lại bytes.

Co-Authored-By: Claude Sonnet 5.5 <noreply@anthropic.com>
</commit_message>
<xml_diff>
--- a/backend/prisma/seed-assets/legacy-docx/bien_nhan_don_thu_mau.docx
+++ b/backend/prisma/seed-assets/legacy-docx/bien_nhan_don_thu_mau.docx
@@ -726,7 +726,7 @@
           <w:color w:val="000000"/>
           <w:spacing w:val="-2"/>
         </w:rPr>
-        <w:t xml:space="preserve">      </w:t>
+        <w:t>${gio}</w:t>
       </w:r>
       <w:r>
         <w:rPr>
@@ -750,7 +750,7 @@
           <w:color w:val="000000"/>
           <w:spacing w:val="-2"/>
         </w:rPr>
-        <w:t xml:space="preserve">     </w:t>
+        <w:t>${phut}</w:t>
       </w:r>
       <w:r>
         <w:rPr>

</xml_diff>

<commit_message>
feat(mẫu hệ cũ): Giấy biên nhận hệ cũ in giờ khai (#518)
* feat(mẫu hệ cũ): Giấy biên nhận hệ cũ in giờ khai vào "Hồi … giờ …"

Hai ô trống của HE_CU_BIEN_NHAN thành ${gio} / ${phut} lấy từ cột gioTiepNhan; hồ sơ thiếu giờ vẫn in khung trống, không bịa giờ.
Mẫu đã nằm trong CSDL cần SEED_TEMPLATES_FORCE_HE_CU=1 để nạp lại bytes.

Co-Authored-By: Claude Sonnet 5.5 <noreply@anthropic.com>

* fix(mẫu hệ cũ): gio/phut chỉ khai cho Đơn thư, không khai chung Vụ việc/Vụ án (Codex P1)

Co-Authored-By: Claude Sonnet 5.5 <noreply@anthropic.com>

---------

Co-authored-by: TRUNG-PC\Than Minh Trung <trungtm@aipower.vn>
Co-authored-by: Claude Sonnet 5.5 <noreply@anthropic.com>
</commit_message>
<xml_diff>
--- a/backend/prisma/seed-assets/legacy-docx/bien_nhan_don_thu_mau.docx
+++ b/backend/prisma/seed-assets/legacy-docx/bien_nhan_don_thu_mau.docx
@@ -726,7 +726,7 @@
           <w:color w:val="000000"/>
           <w:spacing w:val="-2"/>
         </w:rPr>
-        <w:t xml:space="preserve">      </w:t>
+        <w:t>${gio}</w:t>
       </w:r>
       <w:r>
         <w:rPr>
@@ -750,7 +750,7 @@
           <w:color w:val="000000"/>
           <w:spacing w:val="-2"/>
         </w:rPr>
-        <w:t xml:space="preserve">     </w:t>
+        <w:t>${phut}</w:t>
       </w:r>
       <w:r>
         <w:rPr>

</xml_diff>